<commit_message>
Ship backlog updates for optimizer, auth, and ProGrade docs
</commit_message>
<xml_diff>
--- a/docs/Freight_Optimization_App_User_Guide.docx
+++ b/docs/Freight_Optimization_App_User_Guide.docx
@@ -5,7 +5,6 @@
     <w:p>
       <w:pPr>
         <w:pStyle w:val="Title"/>
-        <w:jc w:val="left"/>
       </w:pPr>
       <w:r>
         <w:t>Freight Optimization App - User Guide</w:t>
@@ -13,12 +12,12 @@
     </w:p>
     <w:p>
       <w:r>
-        <w:t>Updated: March 24, 2026</w:t>
+        <w:t>Updated: June 2, 2026</w:t>
       </w:r>
     </w:p>
     <w:p>
       <w:r>
-        <w:t>This guide covers the main planner workflows in the app: uploading open orders, generating loads, reviewing and approving loads, maintaining settings, and reviewing prior planning sessions.</w:t>
+        <w:t>This guide standardizes the planner workflow for the Carry-On Tool (COT): sign-in and account access, daily order intake, draft-load generation, load review and approvals, manual edits, and operational exports.</w:t>
       </w:r>
     </w:p>
     <w:p>
@@ -26,38 +25,435 @@
         <w:pStyle w:val="Heading1"/>
       </w:pPr>
       <w:r>
-        <w:t>1) Sign In and Navigate</w:t>
+        <w:t>Executive Summary</w:t>
+      </w:r>
+    </w:p>
+    <w:tbl>
+      <w:tblPr>
+        <w:tblStyle w:val="TableGrid"/>
+        <w:tblW w:type="auto" w:w="0"/>
+        <w:tblLook w:firstColumn="1" w:firstRow="1" w:lastColumn="0" w:lastRow="0" w:noHBand="0" w:noVBand="1" w:val="04A0"/>
+      </w:tblPr>
+      <w:tblGrid>
+        <w:gridCol w:w="5040"/>
+        <w:gridCol w:w="5040"/>
+      </w:tblGrid>
+      <w:tr>
+        <w:tc>
+          <w:tcPr>
+            <w:tcW w:type="dxa" w:w="5040"/>
+          </w:tcPr>
+          <w:p>
+            <w:r>
+              <w:t>Strategic Purpose</w:t>
+              <w:br/>
+              <w:t>COT converts open-order demand into planner-ready load plans using standardized utilization, routing, and costing logic.</w:t>
+              <w:br/>
+              <w:br/>
+              <w:t>Primary Users</w:t>
+              <w:br/>
+              <w:t>Dispatch and planning teams, shipping leadership, and operations admins supporting settings and data quality.</w:t>
+            </w:r>
+          </w:p>
+        </w:tc>
+        <w:tc>
+          <w:tcPr>
+            <w:tcW w:type="dxa" w:w="5040"/>
+          </w:tcPr>
+          <w:p>
+            <w:r>
+              <w:t>Why It Matters</w:t>
+              <w:br/>
+              <w:t>- Improves trailer utilization and freight economics</w:t>
+              <w:br/>
+              <w:t>- Standardizes intake and load-review decision making</w:t>
+              <w:br/>
+              <w:t>- Preserves planner control through manual edits and approvals</w:t>
+              <w:br/>
+              <w:t>- Produces consistent operational outputs for fulfillment and dispatch</w:t>
+            </w:r>
+          </w:p>
+        </w:tc>
+      </w:tr>
+    </w:tbl>
+    <w:p>
+      <w:pPr/>
+      <w:r>
+        <w:t>End-to-End Workflow</w:t>
+      </w:r>
+    </w:p>
+    <w:tbl>
+      <w:tblPr>
+        <w:tblStyle w:val="TableGrid"/>
+        <w:tblW w:type="auto" w:w="0"/>
+        <w:tblLook w:firstColumn="1" w:firstRow="1" w:lastColumn="0" w:lastRow="0" w:noHBand="0" w:noVBand="1" w:val="04A0"/>
+      </w:tblPr>
+      <w:tblGrid>
+        <w:gridCol w:w="1120"/>
+        <w:gridCol w:w="1120"/>
+        <w:gridCol w:w="1120"/>
+        <w:gridCol w:w="1120"/>
+        <w:gridCol w:w="1120"/>
+        <w:gridCol w:w="1120"/>
+        <w:gridCol w:w="1120"/>
+        <w:gridCol w:w="1120"/>
+        <w:gridCol w:w="1120"/>
+      </w:tblGrid>
+      <w:tr>
+        <w:tc>
+          <w:tcPr>
+            <w:tcW w:type="dxa" w:w="1120"/>
+          </w:tcPr>
+          <w:p>
+            <w:r>
+              <w:t>1</w:t>
+            </w:r>
+          </w:p>
+        </w:tc>
+        <w:tc>
+          <w:tcPr>
+            <w:tcW w:type="dxa" w:w="1120"/>
+          </w:tcPr>
+          <w:p>
+            <w:r>
+              <w:t>Access</w:t>
+            </w:r>
+          </w:p>
+        </w:tc>
+        <w:tc>
+          <w:tcPr>
+            <w:tcW w:type="dxa" w:w="1120"/>
+          </w:tcPr>
+          <w:p>
+            <w:r>
+              <w:t>SSO and account selection</w:t>
+            </w:r>
+          </w:p>
+        </w:tc>
+        <w:tc>
+          <w:tcPr>
+            <w:tcW w:type="dxa" w:w="1120"/>
+          </w:tcPr>
+          <w:p>
+            <w:r>
+              <w:t>&gt;</w:t>
+            </w:r>
+          </w:p>
+        </w:tc>
+        <w:tc>
+          <w:tcPr>
+            <w:tcW w:type="dxa" w:w="1120"/>
+          </w:tcPr>
+          <w:p>
+            <w:r>
+              <w:t>2</w:t>
+            </w:r>
+          </w:p>
+        </w:tc>
+        <w:tc>
+          <w:tcPr>
+            <w:tcW w:type="dxa" w:w="1120"/>
+          </w:tcPr>
+          <w:p>
+            <w:r>
+              <w:t>Daily Intake</w:t>
+            </w:r>
+          </w:p>
+        </w:tc>
+        <w:tc>
+          <w:tcPr>
+            <w:tcW w:type="dxa" w:w="1120"/>
+          </w:tcPr>
+          <w:p>
+            <w:r>
+              <w:t>Upload and validate orders</w:t>
+            </w:r>
+          </w:p>
+        </w:tc>
+        <w:tc>
+          <w:tcPr>
+            <w:tcW w:type="dxa" w:w="1120"/>
+          </w:tcPr>
+          <w:p>
+            <w:r>
+              <w:t>&gt;</w:t>
+            </w:r>
+          </w:p>
+        </w:tc>
+        <w:tc>
+          <w:tcPr>
+            <w:tcW w:type="dxa" w:w="1120"/>
+          </w:tcPr>
+          <w:p>
+            <w:r>
+              <w:t>3) Build, Review, Approve</w:t>
+            </w:r>
+          </w:p>
+        </w:tc>
+      </w:tr>
+    </w:tbl>
+    <w:p>
+      <w:pPr>
+        <w:pStyle w:val="Heading1"/>
+      </w:pPr>
+      <w:r>
+        <w:t>Business Value and Expected Outcomes</w:t>
       </w:r>
     </w:p>
     <w:p>
       <w:pPr>
-        <w:pStyle w:val="ListNumber"/>
+        <w:pStyle w:val="Heading2"/>
       </w:pPr>
       <w:r>
-        <w:t>Open the app login page and select your account profile.</w:t>
+        <w:t>Key Operational Outcomes</w:t>
       </w:r>
     </w:p>
     <w:p>
       <w:pPr>
-        <w:pStyle w:val="ListNumber"/>
+        <w:pStyle w:val="ListParagraph"/>
       </w:pPr>
       <w:r>
-        <w:t>If you choose an Admin profile, enter the admin password and sign in.</w:t>
+        <w:t>Faster planning cycles from sign-in through final approval</w:t>
       </w:r>
     </w:p>
     <w:p>
       <w:pPr>
-        <w:pStyle w:val="ListNumber"/>
+        <w:pStyle w:val="ListParagraph"/>
       </w:pPr>
       <w:r>
-        <w:t>Use the left navigation to move between Orders, Loads, Session History, Settings, and Dashboard.</w:t>
+        <w:t>Clearer daily data-quality checks before optimization runs</w:t>
+      </w:r>
+    </w:p>
+    <w:p>
+      <w:pPr>
+        <w:pStyle w:val="ListParagraph"/>
+      </w:pPr>
+      <w:r>
+        <w:t>Reduced risk from stale order data, unmapped SKUs, and source-vs-tool load assignment drift</w:t>
+      </w:r>
+    </w:p>
+    <w:p>
+      <w:pPr>
+        <w:pStyle w:val="ListParagraph"/>
+      </w:pPr>
+      <w:r>
+        <w:t>Improved planner confidence through schematic editing, manual order add, and trailer selection tools</w:t>
+      </w:r>
+    </w:p>
+    <w:p>
+      <w:pPr>
+        <w:pStyle w:val="ListParagraph"/>
+      </w:pPr>
+      <w:r>
+        <w:t>Better auditability through session history, load reports, and exports</w:t>
+      </w:r>
+    </w:p>
+    <w:p>
+      <w:pPr>
+        <w:pStyle w:val="Heading2"/>
+      </w:pPr>
+      <w:r>
+        <w:t>Primary User Use Cases</w:t>
+      </w:r>
+    </w:p>
+    <w:tbl>
+      <w:tblPr>
+        <w:tblStyle w:val="TableGrid"/>
+        <w:tblW w:type="auto" w:w="0"/>
+        <w:tblLook w:firstColumn="1" w:firstRow="1" w:lastColumn="0" w:lastRow="0" w:noHBand="0" w:noVBand="1" w:val="04A0"/>
+      </w:tblPr>
+      <w:tblGrid>
+        <w:gridCol w:w="3360"/>
+        <w:gridCol w:w="3360"/>
+        <w:gridCol w:w="3360"/>
+      </w:tblGrid>
+      <w:tr>
+        <w:tc>
+          <w:tcPr>
+            <w:tcW w:type="dxa" w:w="3360"/>
+          </w:tcPr>
+          <w:p>
+            <w:r>
+              <w:t>User Group</w:t>
+            </w:r>
+          </w:p>
+        </w:tc>
+        <w:tc>
+          <w:tcPr>
+            <w:tcW w:type="dxa" w:w="3360"/>
+          </w:tcPr>
+          <w:p>
+            <w:r>
+              <w:t>Typical Trigger</w:t>
+            </w:r>
+          </w:p>
+        </w:tc>
+        <w:tc>
+          <w:tcPr>
+            <w:tcW w:type="dxa" w:w="3360"/>
+          </w:tcPr>
+          <w:p>
+            <w:r>
+              <w:t>Business Value</w:t>
+            </w:r>
+          </w:p>
+        </w:tc>
+      </w:tr>
+      <w:tr>
+        <w:tc>
+          <w:tcPr>
+            <w:tcW w:type="dxa" w:w="3360"/>
+          </w:tcPr>
+          <w:p>
+            <w:r>
+              <w:t>Planner / Dispatcher</w:t>
+            </w:r>
+          </w:p>
+        </w:tc>
+        <w:tc>
+          <w:tcPr>
+            <w:tcW w:type="dxa" w:w="3360"/>
+          </w:tcPr>
+          <w:p>
+            <w:r>
+              <w:t>Daily open-order cycle</w:t>
+            </w:r>
+          </w:p>
+        </w:tc>
+        <w:tc>
+          <w:tcPr>
+            <w:tcW w:type="dxa" w:w="3360"/>
+          </w:tcPr>
+          <w:p>
+            <w:r>
+              <w:t>Upload current orders, generate draft loads, and refine exceptions quickly.</w:t>
+            </w:r>
+          </w:p>
+        </w:tc>
+      </w:tr>
+      <w:tr>
+        <w:tc>
+          <w:tcPr>
+            <w:tcW w:type="dxa" w:w="3360"/>
+          </w:tcPr>
+          <w:p>
+            <w:r>
+              <w:t>Shipping Leadership</w:t>
+            </w:r>
+          </w:p>
+        </w:tc>
+        <w:tc>
+          <w:tcPr>
+            <w:tcW w:type="dxa" w:w="3360"/>
+          </w:tcPr>
+          <w:p>
+            <w:r>
+              <w:t>Load approval and exception review</w:t>
+            </w:r>
+          </w:p>
+        </w:tc>
+        <w:tc>
+          <w:tcPr>
+            <w:tcW w:type="dxa" w:w="3360"/>
+          </w:tcPr>
+          <w:p>
+            <w:r>
+              <w:t>Validate route, cost, trailer fit, and approval readiness with consistent assumptions.</w:t>
+            </w:r>
+          </w:p>
+        </w:tc>
+      </w:tr>
+      <w:tr>
+        <w:tc>
+          <w:tcPr>
+            <w:tcW w:type="dxa" w:w="3360"/>
+          </w:tcPr>
+          <w:p>
+            <w:r>
+              <w:t>Admin / Super User</w:t>
+            </w:r>
+          </w:p>
+        </w:tc>
+        <w:tc>
+          <w:tcPr>
+            <w:tcW w:type="dxa" w:w="3360"/>
+          </w:tcPr>
+          <w:p>
+            <w:r>
+              <w:t>Settings and reference-data upkeep</w:t>
+            </w:r>
+          </w:p>
+        </w:tc>
+        <w:tc>
+          <w:tcPr>
+            <w:tcW w:type="dxa" w:w="3360"/>
+          </w:tcPr>
+          <w:p>
+            <w:r>
+              <w:t>Maintain SKU, rate, and mapping assumptions that drive optimization quality.</w:t>
+            </w:r>
+          </w:p>
+        </w:tc>
+      </w:tr>
+    </w:tbl>
+    <w:p>
+      <w:pPr>
+        <w:pStyle w:val="Heading1"/>
+      </w:pPr>
+      <w:r>
+        <w:t>Core Workflow With Planner Notes</w:t>
+      </w:r>
+    </w:p>
+    <w:p>
+      <w:r>
+        <w:t>COT follows a consistent daily planner workflow. The steps below keep the production-safe sequence intact: access, intake, optimize, review, approve, and export.</w:t>
+      </w:r>
+    </w:p>
+    <w:p>
+      <w:pPr>
+        <w:pStyle w:val="Heading2"/>
+      </w:pPr>
+      <w:r>
+        <w:t>Step 1 - Select Account and Complete Sign-In</w:t>
+      </w:r>
+    </w:p>
+    <w:p>
+      <w:pPr>
+        <w:pStyle w:val="ListParagraph"/>
+      </w:pPr>
+      <w:r>
+        <w:t>If Microsoft Entra SSO is enabled in the environment, start with Continue with Microsoft and complete the identity check first.</w:t>
+      </w:r>
+    </w:p>
+    <w:p>
+      <w:pPr>
+        <w:pStyle w:val="ListParagraph"/>
+      </w:pPr>
+      <w:r>
+        <w:t>After SSO clears, or in legacy-login environments, choose the correct planner or admin account from the Select Account dropdown.</w:t>
+      </w:r>
+    </w:p>
+    <w:p>
+      <w:pPr>
+        <w:pStyle w:val="ListParagraph"/>
+      </w:pPr>
+      <w:r>
+        <w:t>Planner accounts sign in directly. Admin accounts require the configured admin password.</w:t>
+      </w:r>
+    </w:p>
+    <w:p>
+      <w:pPr>
+        <w:pStyle w:val="ListParagraph"/>
+      </w:pPr>
+      <w:r>
+        <w:t>Use the focus-plant chips and role label on the login screen to confirm you selected the right access profile before continuing.</w:t>
       </w:r>
     </w:p>
     <w:p>
       <w:r>
         <w:drawing>
           <wp:inline xmlns:a="http://schemas.openxmlformats.org/drawingml/2006/main" xmlns:pic="http://schemas.openxmlformats.org/drawingml/2006/picture">
-            <wp:extent cx="6035040" cy="3696462"/>
+            <wp:extent cx="6217920" cy="4274820"/>
             <wp:docPr id="1" name="Picture 1"/>
             <wp:cNvGraphicFramePr>
               <a:graphicFrameLocks noChangeAspect="1"/>
@@ -66,7 +462,7 @@
               <a:graphicData uri="http://schemas.openxmlformats.org/drawingml/2006/picture">
                 <pic:pic>
                   <pic:nvPicPr>
-                    <pic:cNvPr id="0" name="12_dashboard_reporting.png"/>
+                    <pic:cNvPr id="0" name="01_login_sso.png"/>
                     <pic:cNvPicPr/>
                   </pic:nvPicPr>
                   <pic:blipFill>
@@ -78,7 +474,7 @@
                   <pic:spPr>
                     <a:xfrm>
                       <a:off x="0" y="0"/>
-                      <a:ext cx="6035040" cy="3696462"/>
+                      <a:ext cx="6217920" cy="4274820"/>
                     </a:xfrm>
                     <a:prstGeom prst="rect"/>
                   </pic:spPr>
@@ -91,86 +487,14 @@
     </w:p>
     <w:p>
       <w:r>
-        <w:rPr>
-          <w:i/>
-        </w:rPr>
-        <w:t>Dashboard view (performance reporting).</w:t>
-      </w:r>
-    </w:p>
-    <w:p>
-      <w:pPr>
-        <w:pStyle w:val="Heading1"/>
-      </w:pPr>
-      <w:r>
-        <w:t>2) Upload Open Orders</w:t>
-      </w:r>
-    </w:p>
-    <w:p>
-      <w:r>
-        <w:t>Use the Data Intake Hub in Orders to keep planning data current.</w:t>
-      </w:r>
-    </w:p>
-    <w:p>
-      <w:pPr>
-        <w:pStyle w:val="ListNumber"/>
-      </w:pPr>
-      <w:r>
-        <w:t>Go to Orders.</w:t>
-      </w:r>
-    </w:p>
-    <w:p>
-      <w:pPr>
-        <w:pStyle w:val="ListNumber"/>
-      </w:pPr>
-      <w:r>
-        <w:t>In Data Intake Hub, click Upload Orders and select the daily CSV export.</w:t>
-      </w:r>
-    </w:p>
-    <w:p>
-      <w:pPr>
-        <w:pStyle w:val="ListNumber"/>
-      </w:pPr>
-      <w:r>
-        <w:t>Wait for the upload progress modal to complete.</w:t>
-      </w:r>
-    </w:p>
-    <w:p>
-      <w:pPr>
-        <w:pStyle w:val="ListNumber"/>
-      </w:pPr>
-      <w:r>
-        <w:t>Review Recent Upload Results for mapped/unmapped counts and order changes.</w:t>
-      </w:r>
-    </w:p>
-    <w:p>
-      <w:pPr>
-        <w:pStyle w:val="ListNumber"/>
-      </w:pPr>
-      <w:r>
-        <w:t>If status shows Outdated, open the refresh guide and complete the daily intake checklist.</w:t>
-      </w:r>
-    </w:p>
-    <w:p>
-      <w:pPr>
-        <w:pStyle w:val="ListBullet"/>
-      </w:pPr>
-      <w:r>
-        <w:t>If unmapped SKUs appear, save SKU specs from the upload modal or Settings -&gt; SKUs before re-running optimization.</w:t>
-      </w:r>
-    </w:p>
-    <w:p>
-      <w:pPr>
-        <w:pStyle w:val="ListBullet"/>
-      </w:pPr>
-      <w:r>
-        <w:t>Use the Last Import timestamp and freshness badge to confirm data recency.</w:t>
+        <w:t>Figure 1. Microsoft Entra sign-in view when SSO is required for the environment.</w:t>
       </w:r>
     </w:p>
     <w:p>
       <w:r>
         <w:drawing>
           <wp:inline xmlns:a="http://schemas.openxmlformats.org/drawingml/2006/main" xmlns:pic="http://schemas.openxmlformats.org/drawingml/2006/picture">
-            <wp:extent cx="6035040" cy="3696462"/>
+            <wp:extent cx="6217920" cy="4663440"/>
             <wp:docPr id="2" name="Picture 2"/>
             <wp:cNvGraphicFramePr>
               <a:graphicFrameLocks noChangeAspect="1"/>
@@ -179,7 +503,7 @@
               <a:graphicData uri="http://schemas.openxmlformats.org/drawingml/2006/picture">
                 <pic:pic>
                   <pic:nvPicPr>
-                    <pic:cNvPr id="0" name="01_orders_main.png"/>
+                    <pic:cNvPr id="0" name="02_login_account_selection.png"/>
                     <pic:cNvPicPr/>
                   </pic:nvPicPr>
                   <pic:blipFill>
@@ -191,7 +515,7 @@
                   <pic:spPr>
                     <a:xfrm>
                       <a:off x="0" y="0"/>
-                      <a:ext cx="6035040" cy="3696462"/>
+                      <a:ext cx="6217920" cy="4663440"/>
                     </a:xfrm>
                     <a:prstGeom prst="rect"/>
                   </pic:spPr>
@@ -204,65 +528,78 @@
     </w:p>
     <w:p>
       <w:r>
-        <w:rPr>
-          <w:i/>
-        </w:rPr>
-        <w:t>Orders page with Data Intake Hub and order snapshot.</w:t>
+        <w:t>Figure 2. Account-selection view used to choose planner or admin access after login is available.</w:t>
       </w:r>
     </w:p>
     <w:p>
       <w:pPr>
-        <w:pStyle w:val="Heading1"/>
+        <w:pStyle w:val="Heading2"/>
       </w:pPr>
       <w:r>
-        <w:t>3) Generate Auto Loads</w:t>
+        <w:t>Step 2 - Upload Open Orders and Validate Intake Results</w:t>
       </w:r>
     </w:p>
     <w:p>
       <w:pPr>
-        <w:pStyle w:val="ListNumber"/>
+        <w:pStyle w:val="ListParagraph"/>
       </w:pPr>
       <w:r>
-        <w:t>From Orders, click Generate Draft Loads.</w:t>
+        <w:t>Open Orders and use the Data Intake Hub as the daily intake checkpoint.</w:t>
       </w:r>
     </w:p>
     <w:p>
       <w:pPr>
-        <w:pStyle w:val="ListNumber"/>
+        <w:pStyle w:val="ListParagraph"/>
       </w:pPr>
       <w:r>
-        <w:t>In Session Config Workbench, set Origin Plant and trailer profile.</w:t>
+        <w:t>If the freshness badge shows Outdated, open the refresh guide and follow the SharePoint / Excel macro checklist before uploading.</w:t>
       </w:r>
     </w:p>
     <w:p>
       <w:pPr>
-        <w:pStyle w:val="ListNumber"/>
+        <w:pStyle w:val="ListParagraph"/>
       </w:pPr>
       <w:r>
-        <w:t>Set scope filters (states/customers), scheduling window, and category scope.</w:t>
+        <w:t>Click Upload Orders and select the latest exported CSV. The app validates required columns, plant/item values, SKU mapping, and dimensional readiness used for stacking.</w:t>
       </w:r>
     </w:p>
     <w:p>
       <w:pPr>
-        <w:pStyle w:val="ListNumber"/>
+        <w:pStyle w:val="ListParagraph"/>
       </w:pPr>
       <w:r>
-        <w:t>Click Generate/Run to build draft loads.</w:t>
+        <w:t>After processing, review Upload Summary counts: total rows, total orders, mapped percent, unmapped SKUs, new orders, changed orders, reopened orders, closed orders, and unchanged orders.</w:t>
       </w:r>
     </w:p>
     <w:p>
       <w:pPr>
-        <w:pStyle w:val="ListNumber"/>
+        <w:pStyle w:val="ListParagraph"/>
       </w:pPr>
       <w:r>
-        <w:t>Open Loads to review output and approve loads.</w:t>
+        <w:t>Review Load Assignment Discrepancies. This highlights orders taken off loads in the source file and orders that still appear on approved tool loads, so planners can decide whether to release them back for replanning or preserve the current approved state.</w:t>
+      </w:r>
+    </w:p>
+    <w:p>
+      <w:pPr>
+        <w:pStyle w:val="ListParagraph"/>
+      </w:pPr>
+      <w:r>
+        <w:t>If new or changed SKUs are unmapped or missing required dimensions/stack limits, the upload can block until SKU specs are reviewed and saved.</w:t>
+      </w:r>
+    </w:p>
+    <w:p>
+      <w:pPr>
+        <w:pStyle w:val="ListParagraph"/>
+      </w:pPr>
+      <w:r>
+        <w:t>Use the Unmapped SKUs panel to approve or enter dimensions, category, and stack assumptions. Saved entries flow into Settings and can then be used to finalize the upload.</w:t>
       </w:r>
     </w:p>
     <w:p>
       <w:r>
         <w:drawing>
           <wp:inline xmlns:a="http://schemas.openxmlformats.org/drawingml/2006/main" xmlns:pic="http://schemas.openxmlformats.org/drawingml/2006/picture">
-            <wp:extent cx="6035040" cy="3696462"/>
+            <wp:extent cx="6217920" cy="4663440"/>
             <wp:docPr id="3" name="Picture 3"/>
             <wp:cNvGraphicFramePr>
               <a:graphicFrameLocks noChangeAspect="1"/>
@@ -271,7 +608,7 @@
               <a:graphicData uri="http://schemas.openxmlformats.org/drawingml/2006/picture">
                 <pic:pic>
                   <pic:nvPicPr>
-                    <pic:cNvPr id="0" name="02_orders_generate_draft_loads.png"/>
+                    <pic:cNvPr id="0" name="03_orders_intake_overview.png"/>
                     <pic:cNvPicPr/>
                   </pic:nvPicPr>
                   <pic:blipFill>
@@ -283,7 +620,7 @@
                   <pic:spPr>
                     <a:xfrm>
                       <a:off x="0" y="0"/>
-                      <a:ext cx="6035040" cy="3696462"/>
+                      <a:ext cx="6217920" cy="4663440"/>
                     </a:xfrm>
                     <a:prstGeom prst="rect"/>
                   </pic:spPr>
@@ -296,65 +633,14 @@
     </w:p>
     <w:p>
       <w:r>
-        <w:rPr>
-          <w:i/>
-        </w:rPr>
-        <w:t>Generate Draft Loads workbench (auto mode).</w:t>
-      </w:r>
-    </w:p>
-    <w:p>
-      <w:pPr>
-        <w:pStyle w:val="Heading1"/>
-      </w:pPr>
-      <w:r>
-        <w:t>4) Generate Loads with Manual SOs (Paste Orders)</w:t>
-      </w:r>
-    </w:p>
-    <w:p>
-      <w:pPr>
-        <w:pStyle w:val="ListNumber"/>
-      </w:pPr>
-      <w:r>
-        <w:t>Open Generate Draft Loads from Orders.</w:t>
-      </w:r>
-    </w:p>
-    <w:p>
-      <w:pPr>
-        <w:pStyle w:val="ListNumber"/>
-      </w:pPr>
-      <w:r>
-        <w:t>Switch Strategy to Paste Orders.</w:t>
-      </w:r>
-    </w:p>
-    <w:p>
-      <w:pPr>
-        <w:pStyle w:val="ListNumber"/>
-      </w:pPr>
-      <w:r>
-        <w:t>Paste SO numbers (one per line, or comma/tab/space separated).</w:t>
-      </w:r>
-    </w:p>
-    <w:p>
-      <w:pPr>
-        <w:pStyle w:val="ListNumber"/>
-      </w:pPr>
-      <w:r>
-        <w:t>Validate the matched count and missing orders preview.</w:t>
-      </w:r>
-    </w:p>
-    <w:p>
-      <w:pPr>
-        <w:pStyle w:val="ListNumber"/>
-      </w:pPr>
-      <w:r>
-        <w:t>Run optimization; the system uses only matching unassigned orders from one plant.</w:t>
+        <w:t>Figure 3. Orders page and Data Intake Hub with freshness status and recent upload outcomes.</w:t>
       </w:r>
     </w:p>
     <w:p>
       <w:r>
         <w:drawing>
           <wp:inline xmlns:a="http://schemas.openxmlformats.org/drawingml/2006/main" xmlns:pic="http://schemas.openxmlformats.org/drawingml/2006/picture">
-            <wp:extent cx="6035040" cy="3696462"/>
+            <wp:extent cx="6217920" cy="2729021"/>
             <wp:docPr id="4" name="Picture 4"/>
             <wp:cNvGraphicFramePr>
               <a:graphicFrameLocks noChangeAspect="1"/>
@@ -363,7 +649,7 @@
               <a:graphicData uri="http://schemas.openxmlformats.org/drawingml/2006/picture">
                 <pic:pic>
                   <pic:nvPicPr>
-                    <pic:cNvPr id="0" name="03_orders_manual_so_paste_mode.png"/>
+                    <pic:cNvPr id="0" name="04_orders_refresh_guide.png"/>
                     <pic:cNvPicPr/>
                   </pic:nvPicPr>
                   <pic:blipFill>
@@ -375,7 +661,7 @@
                   <pic:spPr>
                     <a:xfrm>
                       <a:off x="0" y="0"/>
-                      <a:ext cx="6035040" cy="3696462"/>
+                      <a:ext cx="6217920" cy="2729021"/>
                     </a:xfrm>
                     <a:prstGeom prst="rect"/>
                   </pic:spPr>
@@ -388,57 +674,14 @@
     </w:p>
     <w:p>
       <w:r>
-        <w:rPr>
-          <w:i/>
-        </w:rPr>
-        <w:t>Paste Orders mode for manual SO-driven load generation.</w:t>
-      </w:r>
-    </w:p>
-    <w:p>
-      <w:pPr>
-        <w:pStyle w:val="Heading1"/>
-      </w:pPr>
-      <w:r>
-        <w:t>5) Monitor and Work Orders in Orders Page</w:t>
-      </w:r>
-    </w:p>
-    <w:p>
-      <w:pPr>
-        <w:pStyle w:val="ListNumber"/>
-      </w:pPr>
-      <w:r>
-        <w:t>Use filter controls (due date, date range, state, customer) to narrow unassigned orders.</w:t>
-      </w:r>
-    </w:p>
-    <w:p>
-      <w:pPr>
-        <w:pStyle w:val="ListNumber"/>
-      </w:pPr>
-      <w:r>
-        <w:t>Use the search box to find orders quickly.</w:t>
-      </w:r>
-    </w:p>
-    <w:p>
-      <w:pPr>
-        <w:pStyle w:val="ListNumber"/>
-      </w:pPr>
-      <w:r>
-        <w:t>Click an order row to open expanded details (stack footprint, line items, map).</w:t>
-      </w:r>
-    </w:p>
-    <w:p>
-      <w:pPr>
-        <w:pStyle w:val="ListNumber"/>
-      </w:pPr>
-      <w:r>
-        <w:t>Review the snapshot cards: total orders, on-load %, unassigned %, and delivery timeline.</w:t>
+        <w:t>Figure 4. Daily refresh checklist shown when the open-order report is outdated.</w:t>
       </w:r>
     </w:p>
     <w:p>
       <w:r>
         <w:drawing>
           <wp:inline xmlns:a="http://schemas.openxmlformats.org/drawingml/2006/main" xmlns:pic="http://schemas.openxmlformats.org/drawingml/2006/picture">
-            <wp:extent cx="6035040" cy="3696462"/>
+            <wp:extent cx="6217920" cy="7156347"/>
             <wp:docPr id="5" name="Picture 5"/>
             <wp:cNvGraphicFramePr>
               <a:graphicFrameLocks noChangeAspect="1"/>
@@ -447,7 +690,7 @@
               <a:graphicData uri="http://schemas.openxmlformats.org/drawingml/2006/picture">
                 <pic:pic>
                   <pic:nvPicPr>
-                    <pic:cNvPr id="0" name="13_order_expanded_details.png"/>
+                    <pic:cNvPr id="0" name="05_upload_results_checks.png"/>
                     <pic:cNvPicPr/>
                   </pic:nvPicPr>
                   <pic:blipFill>
@@ -459,7 +702,7 @@
                   <pic:spPr>
                     <a:xfrm>
                       <a:off x="0" y="0"/>
-                      <a:ext cx="6035040" cy="3696462"/>
+                      <a:ext cx="6217920" cy="7156347"/>
                     </a:xfrm>
                     <a:prstGeom prst="rect"/>
                   </pic:spPr>
@@ -472,73 +715,118 @@
     </w:p>
     <w:p>
       <w:r>
-        <w:rPr>
-          <w:i/>
-        </w:rPr>
-        <w:t>Expanded order detail pane (stack/line/map).</w:t>
+        <w:t>Figure 5. Representative upload-results modal showing summary counts, load-assignment discrepancy review, and unmapped SKU capture.</w:t>
       </w:r>
     </w:p>
     <w:p>
       <w:pPr>
-        <w:pStyle w:val="Heading1"/>
+        <w:pStyle w:val="Heading2"/>
       </w:pPr>
       <w:r>
-        <w:t>6) Approve Loads</w:t>
+        <w:t>Step 3 - Build Draft Loads</w:t>
       </w:r>
     </w:p>
     <w:p>
       <w:pPr>
-        <w:pStyle w:val="ListNumber"/>
+        <w:pStyle w:val="ListParagraph"/>
       </w:pPr>
       <w:r>
-        <w:t>Open a load detail from Loads (or Session Detail -&gt; View Loads).</w:t>
+        <w:t>From Orders, click Generate Draft Loads to open Session Config Workbench.</w:t>
       </w:r>
     </w:p>
     <w:p>
       <w:pPr>
-        <w:pStyle w:val="ListNumber"/>
+        <w:pStyle w:val="ListParagraph"/>
       </w:pPr>
       <w:r>
-        <w:t>Review route timeline, map, manifest, utilization grade, and estimated freight metrics.</w:t>
+        <w:t>Set the origin plant, preferred trailer profile, scheduling window, and customer/state scope.</w:t>
       </w:r>
     </w:p>
     <w:p>
       <w:pPr>
-        <w:pStyle w:val="ListNumber"/>
+        <w:pStyle w:val="ListParagraph"/>
       </w:pPr>
       <w:r>
-        <w:t>Use Approve to Draft or Approve &amp; Lock to finalize.</w:t>
+        <w:t>Use Auto Optimize for standard batch planning runs or Paste Orders for controlled SO-specific load generation.</w:t>
       </w:r>
     </w:p>
     <w:p>
       <w:pPr>
-        <w:pStyle w:val="ListNumber"/>
+        <w:pStyle w:val="ListParagraph"/>
       </w:pPr>
       <w:r>
-        <w:t>Use Unapprove to Draft if a finalized load needs to move back to draft status.</w:t>
+        <w:t>Confirm the in-scope order count before running the optimizer.</w:t>
       </w:r>
     </w:p>
     <w:p>
       <w:pPr>
-        <w:pStyle w:val="ListBullet"/>
+        <w:pStyle w:val="Heading2"/>
       </w:pPr>
       <w:r>
-        <w:t>Approve &amp; Lock assigns the final load number and can complete the session when all loads are finalized.</w:t>
+        <w:t>Step 4 - Review, Edit, and Approve Loads</w:t>
       </w:r>
     </w:p>
     <w:p>
       <w:pPr>
-        <w:pStyle w:val="ListBullet"/>
+        <w:pStyle w:val="ListParagraph"/>
       </w:pPr>
       <w:r>
-        <w:t>Approved loads are read-only for key layout edits.</w:t>
+        <w:t>Use the Loads Review Center to compare draft loads, inspect utilization, warnings, route geography, and freight impact before approving.</w:t>
+      </w:r>
+    </w:p>
+    <w:p>
+      <w:pPr>
+        <w:pStyle w:val="ListParagraph"/>
+      </w:pPr>
+      <w:r>
+        <w:t>Open a specific load to review route timeline, map, schematic, manifest, utilization grade, estimated miles, and estimated cost in one page.</w:t>
+      </w:r>
+    </w:p>
+    <w:p>
+      <w:pPr>
+        <w:pStyle w:val="ListParagraph"/>
+      </w:pPr>
+      <w:r>
+        <w:t>Use Edit Schematic from the Loads Review Center to drag units between stacks and decks, reset to the base layout if needed, and save the revised arrangement. The editor surfaces overflow and overhang warnings before save.</w:t>
+      </w:r>
+    </w:p>
+    <w:p>
+      <w:pPr>
+        <w:pStyle w:val="ListParagraph"/>
+      </w:pPr>
+      <w:r>
+        <w:t>Use Manually Add Orders to search eligible draft-scope orders, preview how added freight changes the footprint, and add selected orders into the current load.</w:t>
+      </w:r>
+    </w:p>
+    <w:p>
+      <w:pPr>
+        <w:pStyle w:val="ListParagraph"/>
+      </w:pPr>
+      <w:r>
+        <w:t>Use the Trailer Type dropdown to switch trailer profiles when a different deck geometry or capacity is needed. This directly affects stacking and utilization calculations.</w:t>
+      </w:r>
+    </w:p>
+    <w:p>
+      <w:pPr>
+        <w:pStyle w:val="ListParagraph"/>
+      </w:pPr>
+      <w:r>
+        <w:t>Use Reverse Sequence when the stop order needs to be flipped before approval.</w:t>
+      </w:r>
+    </w:p>
+    <w:p>
+      <w:pPr>
+        <w:pStyle w:val="ListParagraph"/>
+      </w:pPr>
+      <w:r>
+        <w:t>Use Approve to Draft during working review, then Approve and Lock when the load is ready to finalize. Approved loads become read-only for key layout actions until they are moved back to draft.</w:t>
       </w:r>
     </w:p>
     <w:p>
       <w:r>
         <w:drawing>
           <wp:inline xmlns:a="http://schemas.openxmlformats.org/drawingml/2006/main" xmlns:pic="http://schemas.openxmlformats.org/drawingml/2006/picture">
-            <wp:extent cx="6035040" cy="3696462"/>
+            <wp:extent cx="6217920" cy="4663440"/>
             <wp:docPr id="6" name="Picture 6"/>
             <wp:cNvGraphicFramePr>
               <a:graphicFrameLocks noChangeAspect="1"/>
@@ -547,7 +835,7 @@
               <a:graphicData uri="http://schemas.openxmlformats.org/drawingml/2006/picture">
                 <pic:pic>
                   <pic:nvPicPr>
-                    <pic:cNvPr id="0" name="15_load_detail_approval_and_schematic.png"/>
+                    <pic:cNvPr id="0" name="07_load_review_center.png"/>
                     <pic:cNvPicPr/>
                   </pic:nvPicPr>
                   <pic:blipFill>
@@ -559,7 +847,7 @@
                   <pic:spPr>
                     <a:xfrm>
                       <a:off x="0" y="0"/>
-                      <a:ext cx="6035040" cy="3696462"/>
+                      <a:ext cx="6217920" cy="4663440"/>
                     </a:xfrm>
                     <a:prstGeom prst="rect"/>
                   </pic:spPr>
@@ -572,113 +860,14 @@
     </w:p>
     <w:p>
       <w:r>
-        <w:rPr>
-          <w:i/>
-        </w:rPr>
-        <w:t>Load detail review and approval controls.</w:t>
-      </w:r>
-    </w:p>
-    <w:p>
-      <w:pPr>
-        <w:pStyle w:val="Heading1"/>
-      </w:pPr>
-      <w:r>
-        <w:t>7) Edit Load Schematics</w:t>
-      </w:r>
-    </w:p>
-    <w:p>
-      <w:pPr>
-        <w:pStyle w:val="ListNumber"/>
-      </w:pPr>
-      <w:r>
-        <w:t>From Loads Review Center, expand a draft load.</w:t>
-      </w:r>
-    </w:p>
-    <w:p>
-      <w:pPr>
-        <w:pStyle w:val="ListNumber"/>
-      </w:pPr>
-      <w:r>
-        <w:t>Click Edit Schematic on the schematic card.</w:t>
-      </w:r>
-    </w:p>
-    <w:p>
-      <w:pPr>
-        <w:pStyle w:val="ListNumber"/>
-      </w:pPr>
-      <w:r>
-        <w:t>Reposition units/stacks as needed and review warning messages.</w:t>
-      </w:r>
-    </w:p>
-    <w:p>
-      <w:pPr>
-        <w:pStyle w:val="ListNumber"/>
-      </w:pPr>
-      <w:r>
-        <w:t>Click Save Schematic. If violations are detected, confirm/save only after review.</w:t>
-      </w:r>
-    </w:p>
-    <w:p>
-      <w:pPr>
-        <w:pStyle w:val="ListNumber"/>
-      </w:pPr>
-      <w:r>
-        <w:t>Use Manually Add Orders if additional SOs should be layered into a draft load before re-optimization.</w:t>
-      </w:r>
-    </w:p>
-    <w:p>
-      <w:pPr>
-        <w:pStyle w:val="Heading1"/>
-      </w:pPr>
-      <w:r>
-        <w:t>8) Update Settings</w:t>
-      </w:r>
-    </w:p>
-    <w:p>
-      <w:pPr>
-        <w:pStyle w:val="ListNumber"/>
-      </w:pPr>
-      <w:r>
-        <w:t>Go to Settings.</w:t>
-      </w:r>
-    </w:p>
-    <w:p>
-      <w:pPr>
-        <w:pStyle w:val="ListNumber"/>
-      </w:pPr>
-      <w:r>
-        <w:t>Use Command Center (Overview) for stop fee, load minimum, fuel surcharge, stop colors, optimizer defaults, and utilization grade thresholds.</w:t>
-      </w:r>
-    </w:p>
-    <w:p>
-      <w:pPr>
-        <w:pStyle w:val="ListNumber"/>
-      </w:pPr>
-      <w:r>
-        <w:t>Use Rates tab for lane rates and carrier-specific rate tables.</w:t>
-      </w:r>
-    </w:p>
-    <w:p>
-      <w:pPr>
-        <w:pStyle w:val="ListNumber"/>
-      </w:pPr>
-      <w:r>
-        <w:t>Use SKUs tab for SKU dimensions/stack rules and lookup mappings.</w:t>
-      </w:r>
-    </w:p>
-    <w:p>
-      <w:pPr>
-        <w:pStyle w:val="ListNumber"/>
-      </w:pPr>
-      <w:r>
-        <w:t>Save each section after edits.</w:t>
+        <w:t>Figure 6. Loads Review Center with draft-load list, selected-load warnings, edit actions, and trailer selector.</w:t>
       </w:r>
     </w:p>
     <w:p>
       <w:r>
         <w:drawing>
           <wp:inline xmlns:a="http://schemas.openxmlformats.org/drawingml/2006/main" xmlns:pic="http://schemas.openxmlformats.org/drawingml/2006/picture">
-            <wp:extent cx="6035040" cy="3696462"/>
+            <wp:extent cx="6217920" cy="4663440"/>
             <wp:docPr id="7" name="Picture 7"/>
             <wp:cNvGraphicFramePr>
               <a:graphicFrameLocks noChangeAspect="1"/>
@@ -687,7 +876,7 @@
               <a:graphicData uri="http://schemas.openxmlformats.org/drawingml/2006/picture">
                 <pic:pic>
                   <pic:nvPicPr>
-                    <pic:cNvPr id="0" name="10_settings_command_center.png"/>
+                    <pic:cNvPr id="0" name="06_load_review_detail.png"/>
                     <pic:cNvPicPr/>
                   </pic:nvPicPr>
                   <pic:blipFill>
@@ -699,7 +888,7 @@
                   <pic:spPr>
                     <a:xfrm>
                       <a:off x="0" y="0"/>
-                      <a:ext cx="6035040" cy="3696462"/>
+                      <a:ext cx="6217920" cy="4663440"/>
                     </a:xfrm>
                     <a:prstGeom prst="rect"/>
                   </pic:spPr>
@@ -712,17 +901,14 @@
     </w:p>
     <w:p>
       <w:r>
-        <w:rPr>
-          <w:i/>
-        </w:rPr>
-        <w:t>Settings Command Center (overview).</w:t>
+        <w:t>Figure 7. Load detail review page with route, schematic, manifest, approval controls, and trailer-change dropdown.</w:t>
       </w:r>
     </w:p>
     <w:p>
       <w:r>
         <w:drawing>
           <wp:inline xmlns:a="http://schemas.openxmlformats.org/drawingml/2006/main" xmlns:pic="http://schemas.openxmlformats.org/drawingml/2006/picture">
-            <wp:extent cx="6035040" cy="3696462"/>
+            <wp:extent cx="6217920" cy="5213956"/>
             <wp:docPr id="8" name="Picture 8"/>
             <wp:cNvGraphicFramePr>
               <a:graphicFrameLocks noChangeAspect="1"/>
@@ -731,7 +917,7 @@
               <a:graphicData uri="http://schemas.openxmlformats.org/drawingml/2006/picture">
                 <pic:pic>
                   <pic:nvPicPr>
-                    <pic:cNvPr id="0" name="11_settings_rates.png"/>
+                    <pic:cNvPr id="0" name="08_schematic_edit_modal.png"/>
                     <pic:cNvPicPr/>
                   </pic:nvPicPr>
                   <pic:blipFill>
@@ -743,7 +929,7 @@
                   <pic:spPr>
                     <a:xfrm>
                       <a:off x="0" y="0"/>
-                      <a:ext cx="6035040" cy="3696462"/>
+                      <a:ext cx="6217920" cy="5213956"/>
                     </a:xfrm>
                     <a:prstGeom prst="rect"/>
                   </pic:spPr>
@@ -756,65 +942,14 @@
     </w:p>
     <w:p>
       <w:r>
-        <w:rPr>
-          <w:i/>
-        </w:rPr>
-        <w:t>Settings Rates tab.</w:t>
-      </w:r>
-    </w:p>
-    <w:p>
-      <w:pPr>
-        <w:pStyle w:val="Heading1"/>
-      </w:pPr>
-      <w:r>
-        <w:t>9) View Previous Sessions</w:t>
-      </w:r>
-    </w:p>
-    <w:p>
-      <w:pPr>
-        <w:pStyle w:val="ListNumber"/>
-      </w:pPr>
-      <w:r>
-        <w:t>Open Session History.</w:t>
-      </w:r>
-    </w:p>
-    <w:p>
-      <w:pPr>
-        <w:pStyle w:val="ListNumber"/>
-      </w:pPr>
-      <w:r>
-        <w:t>Filter by plant/planner/date and search for the target session.</w:t>
-      </w:r>
-    </w:p>
-    <w:p>
-      <w:pPr>
-        <w:pStyle w:val="ListNumber"/>
-      </w:pPr>
-      <w:r>
-        <w:t>Select a session row to open the detail preview.</w:t>
-      </w:r>
-    </w:p>
-    <w:p>
-      <w:pPr>
-        <w:pStyle w:val="ListNumber"/>
-      </w:pPr>
-      <w:r>
-        <w:t>Use Resume (for draft sessions), Load Report, or Export Excel as needed.</w:t>
-      </w:r>
-    </w:p>
-    <w:p>
-      <w:pPr>
-        <w:pStyle w:val="ListNumber"/>
-      </w:pPr>
-      <w:r>
-        <w:t>Use Archive actions to close sessions while preserving history.</w:t>
+        <w:t>Figure 8. Edit Schematic modal used to reposition units and resolve fit issues before saving.</w:t>
       </w:r>
     </w:p>
     <w:p>
       <w:r>
         <w:drawing>
           <wp:inline xmlns:a="http://schemas.openxmlformats.org/drawingml/2006/main" xmlns:pic="http://schemas.openxmlformats.org/drawingml/2006/picture">
-            <wp:extent cx="6035040" cy="3696462"/>
+            <wp:extent cx="6217920" cy="4215539"/>
             <wp:docPr id="9" name="Picture 9"/>
             <wp:cNvGraphicFramePr>
               <a:graphicFrameLocks noChangeAspect="1"/>
@@ -823,7 +958,7 @@
               <a:graphicData uri="http://schemas.openxmlformats.org/drawingml/2006/picture">
                 <pic:pic>
                   <pic:nvPicPr>
-                    <pic:cNvPr id="0" name="04_session_history.png"/>
+                    <pic:cNvPr id="0" name="09_manual_add_modal.png"/>
                     <pic:cNvPicPr/>
                   </pic:nvPicPr>
                   <pic:blipFill>
@@ -835,7 +970,7 @@
                   <pic:spPr>
                     <a:xfrm>
                       <a:off x="0" y="0"/>
-                      <a:ext cx="6035040" cy="3696462"/>
+                      <a:ext cx="6217920" cy="4215539"/>
                     </a:xfrm>
                     <a:prstGeom prst="rect"/>
                   </pic:spPr>
@@ -848,54 +983,71 @@
     </w:p>
     <w:p>
       <w:r>
-        <w:rPr>
-          <w:i/>
-        </w:rPr>
-        <w:t>Session History (audit view).</w:t>
+        <w:t>Figure 9. Manually Add Orders modal used to preview footprint impact before adding draft-scope orders to the load.</w:t>
       </w:r>
     </w:p>
     <w:p>
+      <w:pPr>
+        <w:pStyle w:val="Heading2"/>
+      </w:pPr>
       <w:r>
-        <w:drawing>
-          <wp:inline xmlns:a="http://schemas.openxmlformats.org/drawingml/2006/main" xmlns:pic="http://schemas.openxmlformats.org/drawingml/2006/picture">
-            <wp:extent cx="6035040" cy="3696462"/>
-            <wp:docPr id="10" name="Picture 10"/>
-            <wp:cNvGraphicFramePr>
-              <a:graphicFrameLocks noChangeAspect="1"/>
-            </wp:cNvGraphicFramePr>
-            <a:graphic>
-              <a:graphicData uri="http://schemas.openxmlformats.org/drawingml/2006/picture">
-                <pic:pic>
-                  <pic:nvPicPr>
-                    <pic:cNvPr id="0" name="14_session_detail_and_exports.png"/>
-                    <pic:cNvPicPr/>
-                  </pic:nvPicPr>
-                  <pic:blipFill>
-                    <a:blip r:embed="rId18"/>
-                    <a:stretch>
-                      <a:fillRect/>
-                    </a:stretch>
-                  </pic:blipFill>
-                  <pic:spPr>
-                    <a:xfrm>
-                      <a:off x="0" y="0"/>
-                      <a:ext cx="6035040" cy="3696462"/>
-                    </a:xfrm>
-                    <a:prstGeom prst="rect"/>
-                  </pic:spPr>
-                </pic:pic>
-              </a:graphicData>
-            </a:graphic>
-          </wp:inline>
-        </w:drawing>
+        <w:t>Step 5 - Maintain Settings and Assumption Quality</w:t>
       </w:r>
     </w:p>
     <w:p>
+      <w:pPr>
+        <w:pStyle w:val="ListParagraph"/>
+      </w:pPr>
       <w:r>
-        <w:rPr>
-          <w:i/>
-        </w:rPr>
-        <w:t>Session Detail with report/export/revise actions.</w:t>
+        <w:t>Use Settings to maintain rates, trailer defaults, SKU dimensions, and lookup mappings.</w:t>
+      </w:r>
+    </w:p>
+    <w:p>
+      <w:pPr>
+        <w:pStyle w:val="ListParagraph"/>
+      </w:pPr>
+      <w:r>
+        <w:t>Treat SKU and lookup edits as operational changes. Incorrect dimensions or mappings cascade directly into bad fit logic, utilization outcomes, and route economics.</w:t>
+      </w:r>
+    </w:p>
+    <w:p>
+      <w:pPr>
+        <w:pStyle w:val="ListParagraph"/>
+      </w:pPr>
+      <w:r>
+        <w:t>After changing settings that affect active planning work, re-open the impacted session and re-check fit and utilization behavior.</w:t>
+      </w:r>
+    </w:p>
+    <w:p>
+      <w:pPr>
+        <w:pStyle w:val="Heading2"/>
+      </w:pPr>
+      <w:r>
+        <w:t>Step 6 - Use Session History, Load Reports, and Exports</w:t>
+      </w:r>
+    </w:p>
+    <w:p>
+      <w:pPr>
+        <w:pStyle w:val="ListParagraph"/>
+      </w:pPr>
+      <w:r>
+        <w:t>Use Session History to resume work, review archived runs, and preserve planning continuity across days.</w:t>
+      </w:r>
+    </w:p>
+    <w:p>
+      <w:pPr>
+        <w:pStyle w:val="ListParagraph"/>
+      </w:pPr>
+      <w:r>
+        <w:t>Open session detail to review optimizer parameters, generated loads, and historical context before replaying or exporting results.</w:t>
+      </w:r>
+    </w:p>
+    <w:p>
+      <w:pPr>
+        <w:pStyle w:val="ListParagraph"/>
+      </w:pPr>
+      <w:r>
+        <w:t>Use Load Report and Export Excel outputs for downstream operational handoff once loads are finalized.</w:t>
       </w:r>
     </w:p>
     <w:p>
@@ -903,33 +1055,132 @@
         <w:pStyle w:val="Heading1"/>
       </w:pPr>
       <w:r>
-        <w:t>10) Other Core Processes Worth Using</w:t>
+        <w:t>Settings and Assumption Management</w:t>
+      </w:r>
+    </w:p>
+    <w:p>
+      <w:r>
+        <w:t>Settings are the operational knowledge base behind optimization quality. Intake mapping, stack behavior, trailer fit, and cost outputs all depend on current settings being accurate.</w:t>
       </w:r>
     </w:p>
     <w:p>
       <w:pPr>
-        <w:pStyle w:val="ListBullet"/>
+        <w:pStyle w:val="Heading2"/>
       </w:pPr>
       <w:r>
-        <w:t>Load Report + Export Excel: produce approved-load outputs for operations.</w:t>
+        <w:t>What Is Configured in Settings</w:t>
       </w:r>
     </w:p>
     <w:p>
       <w:pPr>
-        <w:pStyle w:val="ListBullet"/>
+        <w:pStyle w:val="ListParagraph"/>
       </w:pPr>
       <w:r>
-        <w:t>Feedback Log: capture reasons for returned orders/loads and review planner feedback trends.</w:t>
+        <w:t>Rate matrix by origin plant and destination state</w:t>
       </w:r>
     </w:p>
     <w:p>
       <w:pPr>
-        <w:pStyle w:val="ListBullet"/>
+        <w:pStyle w:val="ListParagraph"/>
       </w:pPr>
       <w:r>
-        <w:t>Replay Eval (Admin): compare optimized vs baseline scenarios for historical analysis.</w:t>
+        <w:t>Stop fee, load minimum, and fuel surcharge assumptions</w:t>
       </w:r>
     </w:p>
+    <w:p>
+      <w:pPr>
+        <w:pStyle w:val="ListParagraph"/>
+      </w:pPr>
+      <w:r>
+        <w:t>SKU dimensions, stack heights, and footprint logic</w:t>
+      </w:r>
+    </w:p>
+    <w:p>
+      <w:pPr>
+        <w:pStyle w:val="ListParagraph"/>
+      </w:pPr>
+      <w:r>
+        <w:t>Item-to-SKU lookup mappings used during intake normalization</w:t>
+      </w:r>
+    </w:p>
+    <w:p>
+      <w:pPr>
+        <w:pStyle w:val="ListParagraph"/>
+      </w:pPr>
+      <w:r>
+        <w:t>Plant trailer defaults, trailer profiles, and optimizer defaults</w:t>
+      </w:r>
+    </w:p>
+    <w:p>
+      <w:pPr>
+        <w:pStyle w:val="ListParagraph"/>
+      </w:pPr>
+      <w:r>
+        <w:t>Utilization grade thresholds used across Orders, Loads, and reports</w:t>
+      </w:r>
+    </w:p>
+    <w:p>
+      <w:pPr>
+        <w:pStyle w:val="Heading2"/>
+      </w:pPr>
+      <w:r>
+        <w:t>How Intake and Review Depend on Settings Quality</w:t>
+      </w:r>
+    </w:p>
+    <w:p>
+      <w:pPr>
+        <w:pStyle w:val="ListParagraph"/>
+      </w:pPr>
+      <w:r>
+        <w:t>Uploads can block when new SKUs are unmapped or when mapped SKUs lack required dimensions/stack rules.</w:t>
+      </w:r>
+    </w:p>
+    <w:p>
+      <w:pPr>
+        <w:pStyle w:val="ListParagraph"/>
+      </w:pPr>
+      <w:r>
+        <w:t>Schematic edits and manual-add previews rely on the same deck, stack, and trailer assumptions stored in Settings.</w:t>
+      </w:r>
+    </w:p>
+    <w:p>
+      <w:pPr>
+        <w:pStyle w:val="ListParagraph"/>
+      </w:pPr>
+      <w:r>
+        <w:t>Load-cost outputs rely on current rate and surcharge configuration.</w:t>
+      </w:r>
+    </w:p>
+    <w:p>
+      <w:pPr>
+        <w:pStyle w:val="Heading1"/>
+      </w:pPr>
+      <w:r>
+        <w:t>Operational Guardrails and Common Mistakes</w:t>
+      </w:r>
+    </w:p>
+    <w:tbl>
+      <w:tblPr>
+        <w:tblStyle w:val="TableGrid"/>
+        <w:tblW w:type="auto" w:w="0"/>
+        <w:tblLook w:firstColumn="1" w:firstRow="1" w:lastColumn="0" w:lastRow="0" w:noHBand="0" w:noVBand="1" w:val="04A0"/>
+      </w:tblPr>
+      <w:tblGrid>
+        <w:gridCol w:w="10080"/>
+      </w:tblGrid>
+      <w:tr>
+        <w:tc>
+          <w:tcPr>
+            <w:tcW w:type="dxa" w:w="10080"/>
+          </w:tcPr>
+          <w:p>
+            <w:r>
+              <w:t>Operating Guardrail: COT is decision support, not a compliance authority. Final shipping release still requires carrier judgment and route or regulatory checks. Run daily intake before optimization, review discrepancy flags during uploads, and treat SKU, lookup, and rate edits as controlled operational data changes.</w:t>
+            </w:r>
+          </w:p>
+        </w:tc>
+      </w:tr>
+    </w:tbl>
     <w:p>
       <w:pPr>
         <w:pStyle w:val="Heading1"/>
@@ -940,39 +1191,47 @@
     </w:p>
     <w:p>
       <w:pPr>
-        <w:pStyle w:val="ListBullet"/>
+        <w:pStyle w:val="ListParagraph"/>
       </w:pPr>
       <w:r>
-        <w:t>Run daily intake first; optimization quality depends on current open-order data.</w:t>
+        <w:t>If the freshness badge is Outdated, complete the refresh guide before generating new draft loads.</w:t>
       </w:r>
     </w:p>
     <w:p>
       <w:pPr>
-        <w:pStyle w:val="ListBullet"/>
+        <w:pStyle w:val="ListParagraph"/>
       </w:pPr>
       <w:r>
-        <w:t>Use Paste Orders mode when planners need controlled SO-specific runs.</w:t>
+        <w:t>If an upload blocks, resolve unmapped SKUs first; do not skip missing fit assumptions.</w:t>
       </w:r>
     </w:p>
     <w:p>
       <w:pPr>
-        <w:pStyle w:val="ListBullet"/>
+        <w:pStyle w:val="ListParagraph"/>
       </w:pPr>
       <w:r>
-        <w:t>Before approving, validate route sequence, stop timing, and schematic warnings.</w:t>
+        <w:t>Use the Loads Review Center for side-by-side draft comparison, then use load detail for final approval checks.</w:t>
       </w:r>
     </w:p>
     <w:p>
       <w:pPr>
-        <w:pStyle w:val="ListBullet"/>
+        <w:pStyle w:val="ListParagraph"/>
       </w:pPr>
       <w:r>
-        <w:t>Use Session History to avoid losing context between planning cycles.</w:t>
+        <w:t>Change trailer type before final approval if geometry or capacity assumptions need to change.</w:t>
+      </w:r>
+    </w:p>
+    <w:p>
+      <w:pPr>
+        <w:pStyle w:val="ListParagraph"/>
+      </w:pPr>
+      <w:r>
+        <w:t>Use Session History instead of recreating partially completed planning work.</w:t>
       </w:r>
     </w:p>
     <w:sectPr>
       <w:pgSz w:w="12240" w:h="15840"/>
-      <w:pgMar w:top="1440" w:right="1800" w:bottom="1440" w:left="1800" w:header="720" w:footer="720" w:gutter="0"/>
+      <w:pgMar w:top="1080" w:right="1080" w:bottom="1080" w:left="1080" w:header="720" w:footer="720" w:gutter="0"/>
       <w:cols w:space="720"/>
       <w:docGrid w:linePitch="360"/>
     </w:sectPr>
@@ -1343,10 +1602,6 @@
     <w:name w:val="Normal"/>
     <w:qFormat/>
     <w:rsid w:val="00FC693F"/>
-    <w:rPr>
-      <w:rFonts w:ascii="Calibri" w:hAnsi="Calibri"/>
-      <w:sz w:val="22"/>
-    </w:rPr>
   </w:style>
   <w:style w:type="paragraph" w:styleId="Header">
     <w:name w:val="header"/>

</xml_diff>